<commit_message>
Update ASUC-SOM_IEEE_Paper.docx with 5-author header, centered guide, and testbed hardware specs
</commit_message>
<xml_diff>
--- a/ASUC-SOM_IEEE_Paper_IEEE.docx
+++ b/ASUC-SOM_IEEE_Paper_IEEE.docx
@@ -17,43 +17,239 @@
         <w:t>ASUC-SOM: Subspace-Aware Adaptive Routing for Sequential Machine Unlearning under GDPR Article 17</w:t>
       </w:r>
     </w:p>
-    <w:p>
-      <w:pPr>
-        <w:spacing w:after="280"/>
+    <w:tbl>
+      <w:tblPr>
+        <w:tblW w:type="auto" w:w="0"/>
         <w:jc w:val="center"/>
-      </w:pPr>
-      <w:r>
-        <w:rPr>
-          <w:rFonts w:ascii="Times New Roman" w:hAnsi="Times New Roman"/>
-          <w:b/>
-          <w:i w:val="0"/>
-          <w:sz w:val="20"/>
-        </w:rPr>
-        <w:t>Mithul Kannan</w:t>
-        <w:br/>
-      </w:r>
-      <w:r>
-        <w:rPr>
-          <w:rFonts w:ascii="Times New Roman" w:hAnsi="Times New Roman"/>
-          <w:b w:val="0"/>
-          <w:i/>
-          <w:sz w:val="18"/>
-        </w:rPr>
-        <w:t>Department of Computer Science and Engineering</w:t>
-        <w:br/>
-        <w:t>Autonomous Systems and Machine Learning Research Group</w:t>
-        <w:br/>
-      </w:r>
-      <w:r>
-        <w:rPr>
-          <w:rFonts w:ascii="Times New Roman" w:hAnsi="Times New Roman"/>
-          <w:b w:val="0"/>
-          <w:i w:val="0"/>
-          <w:sz w:val="18"/>
-        </w:rPr>
-        <w:t>mithulkannan@ieee.org</w:t>
-      </w:r>
-    </w:p>
+        <w:tblLook w:firstColumn="1" w:firstRow="1" w:lastColumn="0" w:lastRow="0" w:noHBand="0" w:noVBand="1" w:val="04A0"/>
+      </w:tblPr>
+      <w:tblGrid>
+        <w:gridCol w:w="2610"/>
+        <w:gridCol w:w="2610"/>
+        <w:gridCol w:w="2610"/>
+        <w:gridCol w:w="2610"/>
+      </w:tblGrid>
+      <w:tr>
+        <w:tc>
+          <w:tcPr>
+            <w:tcW w:type="dxa" w:w="2610"/>
+            <w:tcBorders/>
+          </w:tcPr>
+          <w:p>
+            <w:pPr>
+              <w:spacing w:before="0" w:after="40" w:line="240" w:lineRule="auto"/>
+              <w:jc w:val="center"/>
+            </w:pPr>
+            <w:r>
+              <w:rPr>
+                <w:rFonts w:ascii="Times New Roman" w:hAnsi="Times New Roman"/>
+                <w:b/>
+                <w:i w:val="0"/>
+                <w:sz w:val="19"/>
+              </w:rPr>
+              <w:t>Mithul Kannan</w:t>
+              <w:br/>
+            </w:r>
+            <w:r>
+              <w:rPr>
+                <w:rFonts w:ascii="Times New Roman" w:hAnsi="Times New Roman"/>
+                <w:b w:val="0"/>
+                <w:i/>
+                <w:sz w:val="16"/>
+              </w:rPr>
+              <w:t>Dept. of CSE (AIML)</w:t>
+              <w:br/>
+              <w:t>NIE, Mysuru, India</w:t>
+              <w:br/>
+            </w:r>
+            <w:r>
+              <w:rPr>
+                <w:rFonts w:ascii="Times New Roman" w:hAnsi="Times New Roman"/>
+                <w:b w:val="0"/>
+                <w:i w:val="0"/>
+                <w:sz w:val="15"/>
+              </w:rPr>
+              <w:t>mithulkannan17@gmail.com</w:t>
+            </w:r>
+          </w:p>
+        </w:tc>
+        <w:tc>
+          <w:tcPr>
+            <w:tcW w:type="dxa" w:w="2610"/>
+            <w:tcBorders/>
+          </w:tcPr>
+          <w:p>
+            <w:pPr>
+              <w:spacing w:before="0" w:after="40" w:line="240" w:lineRule="auto"/>
+              <w:jc w:val="center"/>
+            </w:pPr>
+            <w:r>
+              <w:rPr>
+                <w:rFonts w:ascii="Times New Roman" w:hAnsi="Times New Roman"/>
+                <w:b/>
+                <w:i w:val="0"/>
+                <w:sz w:val="19"/>
+              </w:rPr>
+              <w:t>K Anantha Krishna Rao</w:t>
+              <w:br/>
+            </w:r>
+            <w:r>
+              <w:rPr>
+                <w:rFonts w:ascii="Times New Roman" w:hAnsi="Times New Roman"/>
+                <w:b w:val="0"/>
+                <w:i/>
+                <w:sz w:val="16"/>
+              </w:rPr>
+              <w:t>Dept. of CSE (AIML)</w:t>
+              <w:br/>
+              <w:t>NIE, Mysuru, India</w:t>
+              <w:br/>
+            </w:r>
+            <w:r>
+              <w:rPr>
+                <w:rFonts w:ascii="Times New Roman" w:hAnsi="Times New Roman"/>
+                <w:b w:val="0"/>
+                <w:i w:val="0"/>
+                <w:sz w:val="15"/>
+              </w:rPr>
+              <w:t>ananthakrishna@nie.ac.in</w:t>
+            </w:r>
+          </w:p>
+        </w:tc>
+        <w:tc>
+          <w:tcPr>
+            <w:tcW w:type="dxa" w:w="2610"/>
+            <w:tcBorders/>
+          </w:tcPr>
+          <w:p>
+            <w:pPr>
+              <w:spacing w:before="0" w:after="40" w:line="240" w:lineRule="auto"/>
+              <w:jc w:val="center"/>
+            </w:pPr>
+            <w:r>
+              <w:rPr>
+                <w:rFonts w:ascii="Times New Roman" w:hAnsi="Times New Roman"/>
+                <w:b/>
+                <w:i w:val="0"/>
+                <w:sz w:val="19"/>
+              </w:rPr>
+              <w:t>M M Kaverappa</w:t>
+              <w:br/>
+            </w:r>
+            <w:r>
+              <w:rPr>
+                <w:rFonts w:ascii="Times New Roman" w:hAnsi="Times New Roman"/>
+                <w:b w:val="0"/>
+                <w:i/>
+                <w:sz w:val="16"/>
+              </w:rPr>
+              <w:t>Dept. of CSE (AIML)</w:t>
+              <w:br/>
+              <w:t>NIE, Mysuru, India</w:t>
+              <w:br/>
+            </w:r>
+            <w:r>
+              <w:rPr>
+                <w:rFonts w:ascii="Times New Roman" w:hAnsi="Times New Roman"/>
+                <w:b w:val="0"/>
+                <w:i w:val="0"/>
+                <w:sz w:val="15"/>
+              </w:rPr>
+              <w:t>kaverappa@nie.ac.in</w:t>
+            </w:r>
+          </w:p>
+        </w:tc>
+        <w:tc>
+          <w:tcPr>
+            <w:tcW w:type="dxa" w:w="2610"/>
+            <w:tcBorders/>
+          </w:tcPr>
+          <w:p>
+            <w:pPr>
+              <w:spacing w:before="0" w:after="40" w:line="240" w:lineRule="auto"/>
+              <w:jc w:val="center"/>
+            </w:pPr>
+            <w:r>
+              <w:rPr>
+                <w:rFonts w:ascii="Times New Roman" w:hAnsi="Times New Roman"/>
+                <w:b/>
+                <w:i w:val="0"/>
+                <w:sz w:val="19"/>
+              </w:rPr>
+              <w:t>M Bharath Mani</w:t>
+              <w:br/>
+            </w:r>
+            <w:r>
+              <w:rPr>
+                <w:rFonts w:ascii="Times New Roman" w:hAnsi="Times New Roman"/>
+                <w:b w:val="0"/>
+                <w:i/>
+                <w:sz w:val="16"/>
+              </w:rPr>
+              <w:t>Dept. of CSE (AIML)</w:t>
+              <w:br/>
+              <w:t>NIE, Mysuru, India</w:t>
+              <w:br/>
+            </w:r>
+            <w:r>
+              <w:rPr>
+                <w:rFonts w:ascii="Times New Roman" w:hAnsi="Times New Roman"/>
+                <w:b w:val="0"/>
+                <w:i w:val="0"/>
+                <w:sz w:val="15"/>
+              </w:rPr>
+              <w:t>bharathmani@nie.ac.in</w:t>
+            </w:r>
+          </w:p>
+        </w:tc>
+      </w:tr>
+      <w:tr>
+        <w:tc>
+          <w:tcPr>
+            <w:tcW w:type="dxa" w:w="10440"/>
+            <w:gridSpan w:val="4"/>
+            <w:tcBorders/>
+          </w:tcPr>
+          <w:p>
+            <w:pPr>
+              <w:spacing w:before="120" w:after="160" w:line="240" w:lineRule="auto"/>
+              <w:jc w:val="center"/>
+            </w:pPr>
+            <w:r>
+              <w:rPr>
+                <w:rFonts w:ascii="Times New Roman" w:hAnsi="Times New Roman"/>
+                <w:b/>
+                <w:i w:val="0"/>
+                <w:sz w:val="19"/>
+              </w:rPr>
+              <w:t>Dr. Mayura Tapkire</w:t>
+              <w:br/>
+            </w:r>
+            <w:r>
+              <w:rPr>
+                <w:rFonts w:ascii="Times New Roman" w:hAnsi="Times New Roman"/>
+                <w:b w:val="0"/>
+                <w:i/>
+                <w:sz w:val="16"/>
+              </w:rPr>
+              <w:t>Associate Professor, Dept. of CSE (Artificial Intelligence &amp; Machine Learning)</w:t>
+              <w:br/>
+              <w:t>The National Institute of Engineering, Mysuru, Karnataka, India</w:t>
+              <w:br/>
+            </w:r>
+            <w:r>
+              <w:rPr>
+                <w:rFonts w:ascii="Times New Roman" w:hAnsi="Times New Roman"/>
+                <w:b w:val="0"/>
+                <w:i w:val="0"/>
+                <w:sz w:val="15"/>
+              </w:rPr>
+              <w:t>mayuratapkire@nie.ac.in</w:t>
+            </w:r>
+          </w:p>
+        </w:tc>
+      </w:tr>
+    </w:tbl>
     <w:p>
       <w:pPr>
         <w:sectPr>
@@ -1445,7 +1641,7 @@
           <w:i w:val="0"/>
           <w:sz w:val="20"/>
         </w:rPr>
-        <w:t>Data and model. We use CIFAR-10 [11], which has C = 10 classes, with a ResNet-18 (11,173,962 parameters) trained to 93.44% test accuracy and 99.40% train retain accuracy. Request stream. Each experiment runs T = 20 sequential rounds. The stream mixes small balanced requests (for example 500 random samples per round across all classes in Workload A, totaling 10,000 deleted images) with class-concentrated ones (Workload B, 500 samples per class per round, H(c) = 0.0), and high-loss requests (Workload C), in a fixed pseudo-random order shared by all methods. Baselines. Gradient ascent, SSD and SalUn are each applied statically at every round, with identical hyper-parameters across rounds. Exact retraining is the reference for cost and for the ideal outcome.</w:t>
+        <w:t>Data and model. We use CIFAR-10 [11], which has C = 10 classes, with a ResNet-18 (11,173,962 parameters) trained to 93.44% test accuracy and 99.40% train retain accuracy after 200 epochs of SGD. Request stream. Each experiment runs T = 20 sequential rounds. The stream mixes small balanced requests (for example 500 random samples per round across all classes in Workload A, totaling 10,000 deleted images) with class-concentrated ones (Workload B, 500 samples per class per round, H(c) = 0.0), and high-loss requests (Workload C), in a fixed pseudo-random order shared by all methods. Baselines. Gradient ascent, SSD and SalUn are each applied statically at every round, with identical hyper-parameters across rounds. Exact retraining is the reference for cost and for the ideal outcome.</w:t>
       </w:r>
     </w:p>
     <w:p>
@@ -1493,7 +1689,7 @@
           <w:i w:val="0"/>
           <w:sz w:val="20"/>
         </w:rPr>
-        <w:t>Reproducibility. Every run logs the request order, the seeds, the SOM score and tier for each round, and the verification measurements, so that any row of Table II can be traced back to a specific stream. Full code, dataset loaders, and raw logs are available at https://github.com/mithulkannan17/Adaptive-unlearning.</w:t>
+        <w:t>Reproducibility &amp; Testbed. All experiments were conducted on an NVIDIA GeForce RTX 4060 Laptop GPU (8 GB VRAM), Intel Core i7-13700H @ 2.40 GHz, 16 GB DDR5 RAM, PyTorch 2.4.1+cu124 on Windows 11. Every run logs the request order, the seeds, the SOM score and tier for each round, and the verification measurements, so that any row of Table II can be traced back to a specific stream. Full code, dataset loaders, and raw logs are available at https://github.com/mithulkannan17/Adaptive-unlearning.</w:t>
       </w:r>
     </w:p>
     <w:p>

</xml_diff>